<commit_message>
Lisa EMDR avastamise lugu ja motivatsioon (Shapiro 1987)
- Francine Shapiro jalutuskäigu lugu algusesse
- Miks see sind puudutab — REM uni, kinniolevad mõtted, 15 min
- Mis on EMDR — lühike selgitus enne protokolli
- Uuendatud koolituskaart, täielik juhend ja veebijuhend

Co-authored-by: reneealuste-commits <reneealuste-commits@users.noreply.github.com>
</commit_message>
<xml_diff>
--- a/emdr-algaja-juhised.docx
+++ b/emdr-algaja-juhised.docx
@@ -44,6 +44,214 @@
           <w:sz w:val="22"/>
         </w:rPr>
         <w:t>Lihtsad sammud bilateral stimulatsiooniga — 15–20 minutit</w:t>
+      </w:r>
+    </w:p>
+    <w:p>
+      <w:pPr>
+        <w:spacing w:before="280" w:after="160"/>
+      </w:pPr>
+      <w:r>
+        <w:rPr>
+          <w:rFonts w:ascii="Calibri" w:hAnsi="Calibri"/>
+          <w:b/>
+          <w:sz w:val="28"/>
+        </w:rPr>
+        <w:t>Lugu — kuidas EMDR sündis</w:t>
+      </w:r>
+    </w:p>
+    <w:p>
+      <w:pPr>
+        <w:spacing w:after="120"/>
+      </w:pPr>
+      <w:r>
+        <w:rPr>
+          <w:rFonts w:ascii="Calibri" w:hAnsi="Calibri"/>
+          <w:b/>
+          <w:i w:val="0"/>
+          <w:sz w:val="22"/>
+        </w:rPr>
+        <w:t>Mai 1987. Üks jalutuskäik pargis.</w:t>
+      </w:r>
+    </w:p>
+    <w:p>
+      <w:pPr>
+        <w:spacing w:after="120"/>
+      </w:pPr>
+      <w:r>
+        <w:rPr>
+          <w:rFonts w:ascii="Calibri" w:hAnsi="Calibri"/>
+          <w:b w:val="0"/>
+          <w:i w:val="0"/>
+          <w:sz w:val="22"/>
+        </w:rPr>
+        <w:t>Francine Shapiro oli psühholoogia doktorant, kes otsis dissertatsiooni teemat ja katsetas oma kehaga nagu laboratooriumis. Ühel päeval jalutaski ta pargis ja märkas midagi imelikku: häiriv mõte tuli peas — ja siis kadus. Ilma igasuguse pingutuseta. Ta pole maha maganud, ta ei unustanud. See lihtsalt kaotas oma haava.</w:t>
+      </w:r>
+    </w:p>
+    <w:p>
+      <w:pPr>
+        <w:spacing w:after="120"/>
+      </w:pPr>
+      <w:r>
+        <w:rPr>
+          <w:rFonts w:ascii="Calibri" w:hAnsi="Calibri"/>
+          <w:b w:val="0"/>
+          <w:i w:val="0"/>
+          <w:sz w:val="22"/>
+        </w:rPr>
+        <w:t>Ta hakkas tähele panna. Iga kord, kui selline mõte tuli, liikusid silmad kergelt, kiiresti — vasakule, paremale, ja tagasi. Ja mõte nõrgene. Kadus.</w:t>
+      </w:r>
+    </w:p>
+    <w:p>
+      <w:pPr>
+        <w:spacing w:after="120"/>
+      </w:pPr>
+      <w:r>
+        <w:rPr>
+          <w:rFonts w:ascii="Calibri" w:hAnsi="Calibri"/>
+          <w:b w:val="0"/>
+          <w:i w:val="0"/>
+          <w:sz w:val="22"/>
+        </w:rPr>
+        <w:t>Siis ta proovis teadlikult. Tõi meelde midagi, mis teda häiris. Liigutas silmi sama viisil. Ja see toimus uuesti. Emotsioon lahjenes. Mõte oli ikka seal — aga enam ei haavanud.</w:t>
+      </w:r>
+    </w:p>
+    <w:p>
+      <w:pPr>
+        <w:spacing w:after="120"/>
+      </w:pPr>
+      <w:r>
+        <w:rPr>
+          <w:rFonts w:ascii="Calibri" w:hAnsi="Calibri"/>
+          <w:b w:val="0"/>
+          <w:i w:val="0"/>
+          <w:sz w:val="22"/>
+        </w:rPr>
+        <w:t>Francine ei leiutanud midagi uut. Ta märkas, mis kehas juba toimub — ja hakkas seda tahtlikult kasutama. Ta kutsus sõpru: "Too midagi, mis sind häirib." Juhendas neid liigutama silmi. See töötas ka nemal.</w:t>
+      </w:r>
+    </w:p>
+    <w:p>
+      <w:pPr>
+        <w:spacing w:after="120"/>
+      </w:pPr>
+      <w:r>
+        <w:rPr>
+          <w:rFonts w:ascii="Calibri" w:hAnsi="Calibri"/>
+          <w:b w:val="0"/>
+          <w:i w:val="0"/>
+          <w:sz w:val="22"/>
+        </w:rPr>
+        <w:t>Kuue kuuga katsetas ta umbes 70 inimesega. 1989. aastal avaldas ta esimese kontrollitud uuringu. Täna on EMDR üks maailma enim uuritud traumateraapia meetodeid — ja see algas ühest jalutuskäikust.</w:t>
+      </w:r>
+    </w:p>
+    <w:p>
+      <w:pPr>
+        <w:spacing w:before="280" w:after="160"/>
+      </w:pPr>
+      <w:r>
+        <w:rPr>
+          <w:rFonts w:ascii="Calibri" w:hAnsi="Calibri"/>
+          <w:b/>
+          <w:sz w:val="28"/>
+        </w:rPr>
+        <w:t>Miks see sind puudutab?</w:t>
+      </w:r>
+    </w:p>
+    <w:p>
+      <w:pPr>
+        <w:spacing w:after="120"/>
+      </w:pPr>
+      <w:r>
+        <w:rPr>
+          <w:rFonts w:ascii="Calibri" w:hAnsi="Calibri"/>
+          <w:b w:val="0"/>
+          <w:i w:val="0"/>
+          <w:sz w:val="22"/>
+        </w:rPr>
+        <w:t>Sa ei pea olema katki, et seda proovida. Sa ei pea aru saama, kuidas see töötab. Piisab 15 minutist.</w:t>
+      </w:r>
+    </w:p>
+    <w:p>
+      <w:pPr>
+        <w:spacing w:after="120"/>
+      </w:pPr>
+      <w:r>
+        <w:rPr>
+          <w:rFonts w:ascii="Calibri" w:hAnsi="Calibri"/>
+          <w:b w:val="0"/>
+          <w:i w:val="0"/>
+          <w:sz w:val="22"/>
+        </w:rPr>
+        <w:t>Sinu aju töötleb igal ööl unes mõtteid — silmad liiguvad REM une ajal vasakule ja paremale. See on looduslik. Aga mõnikord jääb mõte kinni: homme esitlus, tüliline lause, pingutus kaelas. See tuleb tagasi ja tagasi, isegi kui sa "ei taha sellele mõelda."</w:t>
+      </w:r>
+    </w:p>
+    <w:p>
+      <w:pPr>
+        <w:spacing w:after="120"/>
+      </w:pPr>
+      <w:r>
+        <w:rPr>
+          <w:rFonts w:ascii="Calibri" w:hAnsi="Calibri"/>
+          <w:b w:val="0"/>
+          <w:i w:val="0"/>
+          <w:sz w:val="22"/>
+        </w:rPr>
+        <w:t>EMDR kodune versioon aitab ajul seda kinniolevat mõtet liikuma lükata — nagu Shapiro silmad pargis jalutades tegid. Mitte sellepärast, et sa oleksid haige. Sellepärast, et su keha juba teab, kuidas tulla rahule. Sa annad sellele 15 minutit ja natuke abi.</w:t>
+      </w:r>
+    </w:p>
+    <w:p>
+      <w:pPr>
+        <w:spacing w:after="120"/>
+        <w:jc w:val="center"/>
+      </w:pPr>
+      <w:r>
+        <w:rPr>
+          <w:rFonts w:ascii="Calibri" w:hAnsi="Calibri"/>
+          <w:b w:val="0"/>
+          <w:i/>
+          <w:sz w:val="22"/>
+        </w:rPr>
+        <w:t>Sa ei pea uskuma mind. Proovi ühe korra. 15 minutit. Üks kerge mõte. Ja vaata, kas su keha vastab.</w:t>
+      </w:r>
+    </w:p>
+    <w:p>
+      <w:pPr>
+        <w:spacing w:before="280" w:after="160"/>
+      </w:pPr>
+      <w:r>
+        <w:rPr>
+          <w:rFonts w:ascii="Calibri" w:hAnsi="Calibri"/>
+          <w:b/>
+          <w:sz w:val="28"/>
+        </w:rPr>
+        <w:t>Mis on EMDR?</w:t>
+      </w:r>
+    </w:p>
+    <w:p>
+      <w:pPr>
+        <w:spacing w:after="120"/>
+      </w:pPr>
+      <w:r>
+        <w:rPr>
+          <w:rFonts w:ascii="Calibri" w:hAnsi="Calibri"/>
+          <w:b w:val="0"/>
+          <w:i w:val="0"/>
+          <w:sz w:val="22"/>
+        </w:rPr>
+        <w:t>EMDR (Eye Movement Desensitization and Reprocessing) kasutab bilateral stimulatsiooni — vahelduvat signaali mõlemale poole keha (silma liigutused, koputused, heli). See aitab ajul töödelda häirivaid mõtteid ja emotsioone loomulikul viisil — mitte surudes, mitte unustades, vaid läbi töötades.</w:t>
+      </w:r>
+    </w:p>
+    <w:p>
+      <w:pPr>
+        <w:spacing w:after="120"/>
+      </w:pPr>
+      <w:r>
+        <w:rPr>
+          <w:rFonts w:ascii="Calibri" w:hAnsi="Calibri"/>
+          <w:b w:val="0"/>
+          <w:i w:val="0"/>
+          <w:sz w:val="22"/>
+        </w:rPr>
+        <w:t>Kodus saad kasutada lihtsustatud versiooni. See ei asenda terapeuti raske trauma korral, aga võib aidata kerge pinge, ärevuse ja uneprobleemide juures.</w:t>
       </w:r>
     </w:p>
     <w:p>
@@ -119,47 +327,6 @@
           <w:sz w:val="22"/>
         </w:rPr>
         <w:t>Paariline töö nõuab usaldust. Te ei pea jagama kogu lugu — piisab ühest kergest teemast.</w:t>
-      </w:r>
-    </w:p>
-    <w:p>
-      <w:pPr>
-        <w:spacing w:before="280" w:after="160"/>
-      </w:pPr>
-      <w:r>
-        <w:rPr>
-          <w:rFonts w:ascii="Calibri" w:hAnsi="Calibri"/>
-          <w:b/>
-          <w:sz w:val="28"/>
-        </w:rPr>
-        <w:t>Mis on EMDR?</w:t>
-      </w:r>
-    </w:p>
-    <w:p>
-      <w:pPr>
-        <w:spacing w:after="120"/>
-      </w:pPr>
-      <w:r>
-        <w:rPr>
-          <w:rFonts w:ascii="Calibri" w:hAnsi="Calibri"/>
-          <w:b w:val="0"/>
-          <w:i w:val="0"/>
-          <w:sz w:val="22"/>
-        </w:rPr>
-        <w:t>EMDR (Eye Movement Desensitization and Reprocessing) kasutab bilateral stimulatsiooni — vahelduvat signaali mõlemale poole keha (silma liigutused, koputused, heli). See aitab ajul töödelda tülisid mõtteid ja emotsioone.</w:t>
-      </w:r>
-    </w:p>
-    <w:p>
-      <w:pPr>
-        <w:spacing w:after="120"/>
-      </w:pPr>
-      <w:r>
-        <w:rPr>
-          <w:rFonts w:ascii="Calibri" w:hAnsi="Calibri"/>
-          <w:b w:val="0"/>
-          <w:i w:val="0"/>
-          <w:sz w:val="22"/>
-        </w:rPr>
-        <w:t>Kodus saad kasutada lihtsustatud versiooni. See ei asenda terapeuti, aga võib aidata kerge pinge, ärevuse ja uneprobleemide korral.</w:t>
       </w:r>
     </w:p>
     <w:p>

</xml_diff>